<commit_message>
docs(ers): evitar la hoja en blanco al final del anexo
El párrafo vacío obligatorio después de la tabla del anexo no entraba en la
última hoja y generaba una hoja en blanco. Se reduce a tamaño mínimo; la ERS
queda en 21 hojas al renderizar con LibreOffice.

Co-Authored-By: Claude Opus 5.5 <noreply@anthropic.com>
</commit_message>
<xml_diff>
--- a/docs/ERS_Fletway.docx
+++ b/docs/ERS_Fletway.docx
@@ -16641,10 +16641,13 @@
           <w:between w:space="0" w:sz="0" w:val="nil"/>
         </w:pBdr>
         <w:shd w:fill="auto" w:val="clear"/>
-        <w:spacing w:after="0" w:before="0" w:line="276" w:lineRule="auto"/>
+        <w:spacing w:after="0" w:before="0" w:line="20" w:lineRule="exact"/>
         <w:ind w:left="0" w:right="0" w:firstLine="0"/>
         <w:jc w:val="left"/>
-        <w:rPr/>
+        <w:rPr>
+          <w:sz w:val="2"/>
+          <w:szCs w:val="2"/>
+        </w:rPr>
       </w:pPr>
       <w:r>
         <w:rPr>

</xml_diff>